<commit_message>
Merge additions into the author's latest draft
Co-Authored-By: Claude Opus 5.5 <noreply@anthropic.com>
Claude-Session: https://claude.ai/code/session_01UunSGkA7xxcu1ZJiDN1zG2
</commit_message>
<xml_diff>
--- a/output/卒論やることリスト.docx
+++ b/output/卒論やることリスト.docx
@@ -64,7 +64,7 @@
         <w:spacing w:after="80" w:line="340"/>
       </w:pPr>
       <w:r>
-        <w:t xml:space="preserve">前半（1〜7章）とフィジーの経験（8.1）・付録の原稿がある（異文化適応のプロセス_卒論全文.docx）</w:t>
+        <w:t xml:space="preserve">前半（1〜7章）とフィジーの経験（8.1）・付録の原稿がある（卒論全文_最新版.docx）</w:t>
       </w:r>
     </w:p>
     <w:p>
@@ -166,7 +166,7 @@
         <w:ind w:left="420"/>
       </w:pPr>
       <w:r>
-        <w:t xml:space="preserve">□　自分で直している最新版と「卒論全文」を1つにまとめる</w:t>
+        <w:t xml:space="preserve">□　今後は「卒論全文_最新版」に直接書き込んでいく（自分の原稿をベースに赤字を加えたもの）</w:t>
       </w:r>
     </w:p>
     <w:p>
@@ -184,7 +184,7 @@
         <w:ind w:left="420"/>
       </w:pPr>
       <w:r>
-        <w:t xml:space="preserve">□　ベトナムの留学期間（半年か1年か）を決めて、すべての箇所をそろえる</w:t>
+        <w:t xml:space="preserve">□　ベトナムの留学期間を、すべて「半年間」にそろえる（概要などの資料も）</w:t>
       </w:r>
     </w:p>
     <w:p>

</xml_diff>

<commit_message>
Add dated adaptation table, restructure methods and experience chapters
Co-Authored-By: Claude Opus 5.5 <noreply@anthropic.com>
Claude-Session: https://claude.ai/code/session_01UunSGkA7xxcu1ZJiDN1zG2
</commit_message>
<xml_diff>
--- a/output/卒論やることリスト.docx
+++ b/output/卒論やることリスト.docx
@@ -210,34 +210,25 @@
           <w:b/>
           <w:bCs/>
         </w:rPr>
-        <w:t xml:space="preserve">フィジー</w:t>
-      </w:r>
-    </w:p>
-    <w:p>
-      <w:pPr>
-        <w:spacing w:after="80" w:line="340"/>
-        <w:ind w:left="420"/>
-      </w:pPr>
-      <w:r>
-        <w:t xml:space="preserve">□　主な経験が、いつ頃（2019年・2020年・2021年）のものかに印を付ける</w:t>
-      </w:r>
-    </w:p>
-    <w:p>
-      <w:pPr>
-        <w:spacing w:after="80" w:line="340"/>
-        <w:ind w:left="420"/>
-      </w:pPr>
-      <w:r>
-        <w:t xml:space="preserve">□　※を付けた経験（羊の解体・悪口・中指・唾など）を、今どう感じているか書く</w:t>
-      </w:r>
-    </w:p>
-    <w:p>
-      <w:pPr>
-        <w:spacing w:after="80" w:line="340"/>
-        <w:ind w:left="420"/>
-      </w:pPr>
-      <w:r>
-        <w:t xml:space="preserve">□　受け入れられなかった経験について、なぜ楽しさに変わらなかったのか、どう折り合いをつけたのかを書く</w:t>
+        <w:t xml:space="preserve">自己紹介とターニングポイント（8.1）</w:t>
+      </w:r>
+    </w:p>
+    <w:p>
+      <w:pPr>
+        <w:spacing w:after="80" w:line="340"/>
+        <w:ind w:left="420"/>
+      </w:pPr>
+      <w:r>
+        <w:t xml:space="preserve">□　自己紹介（育った環境、海外に興味を持ったきっかけ、留学を決めた理由）を書く</w:t>
+      </w:r>
+    </w:p>
+    <w:p>
+      <w:pPr>
+        <w:spacing w:after="80" w:line="340"/>
+        <w:ind w:left="420"/>
+      </w:pPr>
+      <w:r>
+        <w:t xml:space="preserve">□　留学のターニングポイントを、日付とともに3〜5つ挙げる</w:t>
       </w:r>
     </w:p>
     <w:p>
@@ -250,25 +241,16 @@
           <w:b/>
           <w:bCs/>
         </w:rPr>
-        <w:t xml:space="preserve">ベトナム</w:t>
-      </w:r>
-    </w:p>
-    <w:p>
-      <w:pPr>
-        <w:spacing w:after="80" w:line="340"/>
-        <w:ind w:left="420"/>
-      </w:pPr>
-      <w:r>
-        <w:t xml:space="preserve">□　フィジーと同じ形で「初めてやったこと・知ったこと・感じたこと」のリストを作る（20〜30項目）</w:t>
-      </w:r>
-    </w:p>
-    <w:p>
-      <w:pPr>
-        <w:spacing w:after="80" w:line="340"/>
-        <w:ind w:left="420"/>
-      </w:pPr>
-      <w:r>
-        <w:t xml:space="preserve">□　期間、戸惑ったこと、楽しめるようになったこと、受け入れられなかったこと、フィジーとの違いを書く</w:t>
+        <w:t xml:space="preserve">カンボジア（8.2）</w:t>
+      </w:r>
+    </w:p>
+    <w:p>
+      <w:pPr>
+        <w:spacing w:after="80" w:line="340"/>
+        <w:ind w:left="420"/>
+      </w:pPr>
+      <w:r>
+        <w:t xml:space="preserve">□　時期・期間・目的と、初めてやったこと、戸惑ったこと、フィジー留学につながったことを書く</w:t>
       </w:r>
     </w:p>
     <w:p>
@@ -281,7 +263,16 @@
           <w:b/>
           <w:bCs/>
         </w:rPr>
-        <w:t xml:space="preserve">原稿の</w:t>
+        <w:t xml:space="preserve">フィジー（1.2の表・8.3）</w:t>
+      </w:r>
+    </w:p>
+    <w:p>
+      <w:pPr>
+        <w:spacing w:after="80" w:line="340"/>
+        <w:ind w:left="420"/>
+      </w:pPr>
+      <w:r>
+        <w:t xml:space="preserve">□　1.2の表の</w:t>
       </w:r>
       <w:r>
         <w:rPr>
@@ -292,10 +283,110 @@
         <w:t xml:space="preserve">【記入】</w:t>
       </w:r>
       <w:r>
+        <w:t xml:space="preserve">を埋める（何年何月何日に何があったか、当時の気持ち、受け入れられたか）</w:t>
+      </w:r>
+    </w:p>
+    <w:p>
+      <w:pPr>
+        <w:spacing w:after="80" w:line="340"/>
+        <w:ind w:left="420"/>
+      </w:pPr>
+      <w:r>
+        <w:t xml:space="preserve">□　ネズミと一緒に住むようになったこと、ディワリで夜ご飯が甘いお菓子だけだったことの時期と気持ちを書く</w:t>
+      </w:r>
+    </w:p>
+    <w:p>
+      <w:pPr>
+        <w:spacing w:after="80" w:line="340"/>
+        <w:ind w:left="420"/>
+      </w:pPr>
+      <w:r>
+        <w:t xml:space="preserve">□　受け入れられなかったことを「何年何月何日、〜を受け入れられなかった」の形で書く</w:t>
+      </w:r>
+    </w:p>
+    <w:p>
+      <w:pPr>
+        <w:spacing w:after="80" w:line="340"/>
+        <w:ind w:left="420"/>
+      </w:pPr>
+      <w:r>
+        <w:t xml:space="preserve">□　段階の当てはめ（ハネムーン期・ショック期など）が自分の感覚と合っているか確かめる</w:t>
+      </w:r>
+    </w:p>
+    <w:p>
+      <w:pPr>
+        <w:spacing w:after="80" w:line="340"/>
+        <w:ind w:left="420"/>
+      </w:pPr>
+      <w:r>
+        <w:t xml:space="preserve">□　※を付けた経験（羊の解体・悪口・中指・唾など）を、今どう感じているか書く</w:t>
+      </w:r>
+    </w:p>
+    <w:p>
+      <w:pPr>
+        <w:spacing w:after="80" w:line="340"/>
+        <w:ind w:left="420"/>
+      </w:pPr>
+      <w:r>
+        <w:t xml:space="preserve">□　受け入れられなかった経験について、なぜ楽しさに変わらなかったのか、どう折り合いをつけたのかを書く</w:t>
+      </w:r>
+    </w:p>
+    <w:p>
+      <w:pPr>
+        <w:keepNext/>
+        <w:spacing w:after="80" w:before="200"/>
+      </w:pPr>
+      <w:r>
         <w:rPr>
           <w:b/>
           <w:bCs/>
         </w:rPr>
+        <w:t xml:space="preserve">ベトナム（8.4）</w:t>
+      </w:r>
+    </w:p>
+    <w:p>
+      <w:pPr>
+        <w:spacing w:after="80" w:line="340"/>
+        <w:ind w:left="420"/>
+      </w:pPr>
+      <w:r>
+        <w:t xml:space="preserve">□　フィジーと同じ形で「初めてやったこと・知ったこと・感じたこと」のリストを作る（20〜30項目）</w:t>
+      </w:r>
+    </w:p>
+    <w:p>
+      <w:pPr>
+        <w:spacing w:after="80" w:line="340"/>
+        <w:ind w:left="420"/>
+      </w:pPr>
+      <w:r>
+        <w:t xml:space="preserve">□　期間、戸惑ったこと、楽しめるようになったこと、受け入れられなかったこと、フィジーとの違いを書く</w:t>
+      </w:r>
+    </w:p>
+    <w:p>
+      <w:pPr>
+        <w:keepNext/>
+        <w:spacing w:after="80" w:before="200"/>
+      </w:pPr>
+      <w:r>
+        <w:rPr>
+          <w:b/>
+          <w:bCs/>
+        </w:rPr>
+        <w:t xml:space="preserve">原稿の</w:t>
+      </w:r>
+      <w:r>
+        <w:rPr>
+          <w:b/>
+          <w:bCs/>
+          <w:color w:val="FF0000"/>
+        </w:rPr>
+        <w:t xml:space="preserve">【記入】</w:t>
+      </w:r>
+      <w:r>
+        <w:rPr>
+          <w:b/>
+          <w:bCs/>
+        </w:rPr>
         <w:t xml:space="preserve">欄</w:t>
       </w:r>
     </w:p>
@@ -422,6 +513,15 @@
     </w:p>
     <w:p>
       <w:pPr>
+        <w:spacing w:after="80" w:line="340"/>
+        <w:ind w:left="420"/>
+      </w:pPr>
+      <w:r>
+        <w:t xml:space="preserve">□　1.2に貼った参考資料（オバーグの原文、長井（1988）、佐々木・水野）を開いて、題名・著者・年を確認する</w:t>
+      </w:r>
+    </w:p>
+    <w:p>
+      <w:pPr>
         <w:keepNext/>
         <w:spacing w:after="140" w:before="280"/>
       </w:pPr>
@@ -439,7 +539,7 @@
         <w:ind w:left="420"/>
       </w:pPr>
       <w:r>
-        <w:t xml:space="preserve">□　協力者を2〜3人決める（うち1人以上は留学がつらかった・なじめなかった人）</w:t>
+        <w:t xml:space="preserve">□　協力者を2〜3人決める（ホームステイや途上国での生活など、似たような経験をした人）</w:t>
       </w:r>
     </w:p>
     <w:p>
@@ -475,7 +575,7 @@
         <w:ind w:left="420"/>
       </w:pPr>
       <w:r>
-        <w:t xml:space="preserve">□　楽しめなかった人とは、自分から留学を選んだか、支えてくれる人がいたか、衝突の種類、期間の長さを比べる</w:t>
+        <w:t xml:space="preserve">□　自分の経験と共通する点・異なる点を整理する</w:t>
       </w:r>
     </w:p>
     <w:p>

</xml_diff>